<commit_message>
Remove LinkedIn from the résumés
Drops the LinkedIn link from the contact line in build.cjs, regenerates the
three .docx files, and updates the PDFs in resume/ and public/ to match.

Co-Authored-By: Claude Opus 5.5 <noreply@anthropic.com>
Claude-Session: https://claude.ai/code/session_01NftkqDaneaQ5s5DU4sEJbG
</commit_message>
<xml_diff>
--- a/resume/AlexanderShahamResume-GameDev.docx
+++ b/resume/AlexanderShahamResume-GameDev.docx
@@ -39,7 +39,7 @@
         </w:rPr>
         <w:t xml:space="preserve"> • </w:t>
       </w:r>
-      <w:hyperlink w:history="1" r:id="rIdfmmbbf8k4k04ocgdwbwf1">
+      <w:hyperlink w:history="1" r:id="rIdxo3jxa11igi27sm-w4jm3">
         <w:r>
           <w:rPr>
             <w:color w:val="555555"/>
@@ -57,7 +57,7 @@
         </w:rPr>
         <w:t xml:space="preserve"> • </w:t>
       </w:r>
-      <w:hyperlink w:history="1" r:id="rIdufc4kxkpurnk1tn36kf1p">
+      <w:hyperlink w:history="1" r:id="rIduwymxcgoumfgqhqpuzsm5">
         <w:r>
           <w:rPr>
             <w:color w:val="555555"/>
@@ -75,7 +75,7 @@
         </w:rPr>
         <w:t xml:space="preserve"> • </w:t>
       </w:r>
-      <w:hyperlink w:history="1" r:id="rIdud8i4m_vznr_cwouenauw">
+      <w:hyperlink w:history="1" r:id="rIdv97fiiprnpjy2ya8luoee">
         <w:r>
           <w:rPr>
             <w:color w:val="555555"/>
@@ -85,24 +85,6 @@
           <w:t xml:space="preserve">github.com/Nuja1337</w:t>
         </w:r>
       </w:hyperlink>
-      <w:r>
-        <w:rPr>
-          <w:color w:val="999999"/>
-          <w:sz w:val="18"/>
-          <w:szCs w:val="18"/>
-        </w:rPr>
-        <w:t xml:space="preserve"> • </w:t>
-      </w:r>
-      <w:hyperlink w:history="1" r:id="rIdgbhrlngzvpr_w3szpgvgg">
-        <w:r>
-          <w:rPr>
-            <w:color w:val="555555"/>
-            <w:sz w:val="18"/>
-            <w:szCs w:val="18"/>
-          </w:rPr>
-          <w:t xml:space="preserve">linkedin.com/in/alexander-shaham</w:t>
-        </w:r>
-      </w:hyperlink>
     </w:p>
     <w:p>
       <w:pPr>
@@ -463,7 +445,7 @@
       <w:r>
         <w:t xml:space="preserve">	</w:t>
       </w:r>
-      <w:hyperlink w:history="1" r:id="rIdizky1rv-pjnb-qgvrui7c">
+      <w:hyperlink w:history="1" r:id="rIdwkqdzrz_1iibgonjpxl8u">
         <w:r>
           <w:rPr>
             <w:color w:val="555555"/>
@@ -522,7 +504,7 @@
       <w:r>
         <w:t xml:space="preserve">	</w:t>
       </w:r>
-      <w:hyperlink w:history="1" r:id="rIdzmbhbz_6i5vaf6rbbxgae">
+      <w:hyperlink w:history="1" r:id="rIdssbzhe93i-7dff34fsrcu">
         <w:r>
           <w:rPr>
             <w:color w:val="555555"/>
@@ -568,7 +550,7 @@
       <w:r>
         <w:t xml:space="preserve">	</w:t>
       </w:r>
-      <w:hyperlink w:history="1" r:id="rIdjbojnrpd0s2fgfna_o7rz">
+      <w:hyperlink w:history="1" r:id="rId6lj7cetw-4t37lhk54cqa">
         <w:r>
           <w:rPr>
             <w:color w:val="555555"/>

</xml_diff>